<commit_message>
feat: migrar despliegue a AWS Academy (EC2 + k3s) con imagen desde GHCR
</commit_message>
<xml_diff>
--- a/docs/Documentacion_Solucion_DevOps.docx
+++ b/docs/Documentacion_Solucion_DevOps.docx
@@ -172,7 +172,7 @@
         <w:t xml:space="preserve">Alcance de este documento: </w:t>
       </w:r>
       <w:r>
-        <w:t xml:space="preserve">se preparó todo el código, configuración e infraestructura como código (manifiestos, pipeline, dashboards). La ejecución real (build de Docker, despliegue en Kubernetes, push a GitHub) se realiza en el computador del estudiante siguiendo la sección 5 “Puesta en marcha”, porque requiere Docker Desktop, kubectl y credenciales de GitHub que no existen en el entorno donde se preparó esta solución.</w:t>
+        <w:t xml:space="preserve">se preparó todo el código, configuración e infraestructura como código (manifiestos, pipeline, dashboards). La ejecución real (build de Docker, despliegue en Kubernetes, push a GitHub) se realiza en una instancia EC2 (Ubuntu 22.04) de AWS Academy Learner Lab con k3s instalado, siguiendo la sección 5 “Puesta en marcha”, porque requiere una cuenta de AWS, kubectl y credenciales de GitHub que no existen en el entorno donde se preparó esta solución.</w:t>
       </w:r>
     </w:p>
     <w:p>
@@ -188,7 +188,7 @@
         <w:spacing w:after="160"/>
       </w:pPr>
       <w:r>
-        <w:t xml:space="preserve">El flujo completo, de extremo a extremo, es el siguiente: el desarrollador hace push a la rama main en GitHub; esto dispara el pipeline de GitHub Actions, que corre en tres jobs encadenados; el último job se ejecuta en un runner instalado en el propio computador del estudiante (runner self-hosted) porque es el único que tiene acceso de red al clúster de Kubernetes local (Docker Desktop).</w:t>
+        <w:t xml:space="preserve">El flujo completo, de extremo a extremo, es el siguiente: el desarrollador hace push a la rama main en GitHub; esto dispara el pipeline de GitHub Actions, que corre en tres jobs encadenados; el segundo job construye la imagen Docker y la publica en GitHub Container Registry (GHCR); el último job se ejecuta en un runner self-hosted instalado dentro de una instancia EC2 de AWS Academy Learner Lab, que tiene un clúster de Kubernetes (k3s) corriendo localmente en esa misma instancia, y que descarga la imagen desde GHCR para desplegarla.</w:t>
       </w:r>
     </w:p>
     <w:p>
@@ -242,7 +242,7 @@
         <w:spacing w:after="160"/>
       </w:pPr>
       <w:r>
-        <w:t xml:space="preserve">Por qué un runner self-hosted: los runners que ofrece GitHub (“ubuntu-latest”) son máquinas efímeras en la nube de GitHub. No tienen ninguna forma de conectarse a un Kubernetes que corre en localhost dentro del computador del estudiante. La única manera de automatizar un despliegue real a ese clúster es que el propio computador actúe como runner: se instala un agente de GitHub Actions que escucha trabajos pendientes y los ejecuta localmente, con acceso directo a Docker y kubectl.</w:t>
+        <w:t xml:space="preserve">Por qué un runner self-hosted: los runners que ofrece GitHub (“ubuntu-latest”) son máquinas efímeras propias de GitHub, sin acceso de red al clúster de Kubernetes desplegado en la nube de AWS. La forma de automatizar un despliegue real a ese clúster es instalar el agente de GitHub Actions dentro de la propia instancia EC2: así el job “deploy” ejecuta kubectl directo contra el k3s local de esa instancia, sin necesidad de exponer el API server de Kubernetes a internet ni manejar credenciales remotas.</w:t>
       </w:r>
     </w:p>
     <w:p>
@@ -893,7 +893,7 @@
                 <w:sz w:val="21"/>
                 <w:szCs w:val="21"/>
               </w:rPr>
-              <w:t xml:space="preserve">Kubernetes (Docker Desktop)</w:t>
+              <w:t xml:space="preserve">Kubernetes (k3s en EC2, AWS Academy Learner Lab)</w:t>
             </w:r>
           </w:p>
         </w:tc>
@@ -1362,49 +1362,14 @@
           <w:szCs w:val="19"/>
         </w:rPr>
         <w:t xml:space="preserve">./mvnw -B sonar:sonar \</w:t>
-      </w:r>
-      <w:r>
-        <w:rPr>
-          <w:rFonts w:ascii="Consolas" w:cs="Consolas" w:eastAsia="Consolas" w:hAnsi="Consolas"/>
-          <w:sz w:val="19"/>
-          <w:szCs w:val="19"/>
-        </w:rPr>
         <w:br/>
         <w:t xml:space="preserve">  -Dsonar.projectKey=PatricioDuoc_proyecto_springboot_usuarios \</w:t>
-      </w:r>
-      <w:r>
-        <w:rPr>
-          <w:rFonts w:ascii="Consolas" w:cs="Consolas" w:eastAsia="Consolas" w:hAnsi="Consolas"/>
-          <w:sz w:val="19"/>
-          <w:szCs w:val="19"/>
-        </w:rPr>
         <w:br/>
         <w:t xml:space="preserve">  -Dsonar.organization=patricioduoc \</w:t>
-      </w:r>
-      <w:r>
-        <w:rPr>
-          <w:rFonts w:ascii="Consolas" w:cs="Consolas" w:eastAsia="Consolas" w:hAnsi="Consolas"/>
-          <w:sz w:val="19"/>
-          <w:szCs w:val="19"/>
-        </w:rPr>
         <w:br/>
         <w:t xml:space="preserve">  -Dsonar.host.url=https://sonarcloud.io \</w:t>
-      </w:r>
-      <w:r>
-        <w:rPr>
-          <w:rFonts w:ascii="Consolas" w:cs="Consolas" w:eastAsia="Consolas" w:hAnsi="Consolas"/>
-          <w:sz w:val="19"/>
-          <w:szCs w:val="19"/>
-        </w:rPr>
         <w:br/>
         <w:t xml:space="preserve">  -Dsonar.token=${SONAR_TOKEN} \</w:t>
-      </w:r>
-      <w:r>
-        <w:rPr>
-          <w:rFonts w:ascii="Consolas" w:cs="Consolas" w:eastAsia="Consolas" w:hAnsi="Consolas"/>
-          <w:sz w:val="19"/>
-          <w:szCs w:val="19"/>
-        </w:rPr>
         <w:br/>
         <w:t xml:space="preserve">  -Dsonar.qualitygate.wait=true</w:t>
       </w:r>
@@ -1789,7 +1754,7 @@
         <w:spacing w:after="80"/>
       </w:pPr>
       <w:r>
-        <w:t xml:space="preserve">docker build de la imagen con el tag del commit (github.sha) y latest.</w:t>
+        <w:t xml:space="preserve">kubectl apply -f k8s/ --recursive, que crea o actualiza todos los recursos.</w:t>
       </w:r>
     </w:p>
     <w:p>
@@ -1802,7 +1767,7 @@
         <w:spacing w:after="80"/>
       </w:pPr>
       <w:r>
-        <w:t xml:space="preserve">kubectl apply -f k8s/ --recursive, que crea o actualiza todos los recursos.</w:t>
+        <w:t xml:space="preserve">kubectl set image deployment/springboot-app springboot-app=ghcr.io/diegoroblem/proyecto_springboot_usuarios:&lt;sha&gt; -n devops-usuarios, para que el Deployment use exactamente la imagen que el job anterior publicó en GHCR.</w:t>
       </w:r>
     </w:p>
     <w:p>
@@ -1815,19 +1780,6 @@
         <w:spacing w:after="80"/>
       </w:pPr>
       <w:r>
-        <w:t xml:space="preserve">kubectl set image deployment/springboot-app springboot-app=springboot-app-devops:&lt;sha&gt; -n devops-usuarios, para que el Deployment use exactamente la imagen recién construida.</w:t>
-      </w:r>
-    </w:p>
-    <w:p>
-      <w:pPr>
-        <w:pStyle w:val="ListParagraph"/>
-        <w:numPr>
-          <w:ilvl w:val="0"/>
-          <w:numId w:val="3"/>
-        </w:numPr>
-        <w:spacing w:after="80"/>
-      </w:pPr>
-      <w:r>
         <w:t xml:space="preserve">kubectl rollout status ..., que espera a que el nuevo Deployment esté realmente disponible (o falla el job si no lo logra en 180s).</w:t>
       </w:r>
     </w:p>
@@ -1836,7 +1788,7 @@
         <w:spacing w:after="160"/>
       </w:pPr>
       <w:r>
-        <w:t xml:space="preserve">Como Docker Desktop Kubernetes comparte el mismo daemon de Docker con el que se construye la imagen, no es necesario subir la imagen a ningún registry para que el clúster la use (imagePullPolicy: IfNotPresent).</w:t>
+        <w:t xml:space="preserve">A diferencia de un clúster local con Docker Desktop, aquí sí es necesario el registry: el job docker-build-push sube la imagen a GHCR y k3s (en la instancia EC2) la descarga desde ahí. Por eso el paquete de GHCR debe ser público (o el clúster necesita un imagePullSecret con credenciales de lectura).</w:t>
       </w:r>
     </w:p>
     <w:p>
@@ -2495,7 +2447,7 @@
         <w:spacing w:after="80"/>
       </w:pPr>
       <w:r>
-        <w:t xml:space="preserve">Docker Desktop instalado, con Kubernetes habilitado (Settings → Kubernetes → Enable Kubernetes).</w:t>
+        <w:t xml:space="preserve">Cuenta de AWS Academy Learner Lab activa, con una instancia EC2 (Ubuntu 22.04, tipo apto para capa gratuita como t3.micro/t2.micro) y k3s instalado (ver sección 5.3).</w:t>
       </w:r>
     </w:p>
     <w:p>
@@ -2521,7 +2473,7 @@
         <w:spacing w:after="80"/>
       </w:pPr>
       <w:r>
-        <w:t xml:space="preserve">kubectl funcionando contra el contexto docker-desktop (kubectl config use-context docker-desktop).</w:t>
+        <w:t xml:space="preserve">kubectl funcionando dentro de la instancia EC2 contra el contexto de k3s (se configura solo al instalar k3s, no requiere pasos extra).</w:t>
       </w:r>
     </w:p>
     <w:p>
@@ -2597,7 +2549,7 @@
         <w:pStyle w:val="Heading2"/>
       </w:pPr>
       <w:r>
-        <w:t xml:space="preserve">5.3 Instalar el runner self-hosted</w:t>
+        <w:t xml:space="preserve">5.3 Lanzar la instancia EC2, instalar k3s y el runner self-hosted</w:t>
       </w:r>
     </w:p>
     <w:p>
@@ -2605,7 +2557,7 @@
         <w:spacing w:after="160"/>
       </w:pPr>
       <w:r>
-        <w:t xml:space="preserve">El job deploy necesita un runner instalado en tu propio computador (es el único con acceso a tu Kubernetes local). Pasos generales:</w:t>
+        <w:t xml:space="preserve">El job deploy necesita un runner instalado dentro de la instancia EC2 (es el único con acceso de red al clúster k3s que corre ahí mismo). Pasos generales:</w:t>
       </w:r>
     </w:p>
     <w:p>
@@ -2618,7 +2570,7 @@
         <w:spacing w:after="80"/>
       </w:pPr>
       <w:r>
-        <w:t xml:space="preserve">En GitHub: Settings → Actions → Runners → New self-hosted runner.</w:t>
+        <w:t xml:space="preserve">En la consola de AWS Academy Learner Lab: Start Lab → EC2 → Launch Instance. AMI Ubuntu 22.04, tipo de instancia apto para capa gratuita (t3.micro o t2.micro), crear/descargar key pair, y un Security Group con el puerto 22 (SSH) y el rango 30000-32767 (NodePorts de Kubernetes) abiertos.</w:t>
       </w:r>
     </w:p>
     <w:p>
@@ -2631,7 +2583,7 @@
         <w:spacing w:after="80"/>
       </w:pPr>
       <w:r>
-        <w:t xml:space="preserve">Elegir el sistema operativo y seguir los comandos que GitHub muestra (descargar el paquete del runner, ./config.sh con la URL del repo y un token temporal que entrega GitHub).</w:t>
+        <w:t xml:space="preserve">Asociar una Elastic IP a la instancia, para que la dirección pública no cambie cada vez que se detiene/inicia (las sesiones del Learner Lab son acotadas en el tiempo).</w:t>
       </w:r>
     </w:p>
     <w:p>
@@ -2644,7 +2596,7 @@
         <w:spacing w:after="80"/>
       </w:pPr>
       <w:r>
-        <w:t xml:space="preserve">Iniciar el runner con ./run.sh (o instalarlo como servicio con ./svc.sh install &amp;&amp; ./svc.sh start, para que quede corriendo en segundo plano).</w:t>
+        <w:t xml:space="preserve">Por SSH, crear un archivo de swap (la instancia de capa gratuita tiene solo 1 GiB de RAM, justo para la app + MySQL + Prometheus + Grafana + Pushgateway + k3s) e instalar k3s con curl -sfL https://get.k3s.io | sh -.</w:t>
       </w:r>
     </w:p>
     <w:p>
@@ -2657,30 +2609,7 @@
         <w:spacing w:after="80"/>
       </w:pPr>
       <w:r>
-        <w:t xml:space="preserve">Verificar en Settings → Actions → Runners que aparece como “Idle” (en línea, esperando trabajos).</w:t>
-      </w:r>
-    </w:p>
-    <w:p>
-      <w:pPr>
-        <w:spacing w:after="160"/>
-      </w:pPr>
-      <w:r>
-        <w:rPr>
-          <w:b/>
-          <w:bCs/>
-        </w:rPr>
-        <w:t xml:space="preserve">Importante: </w:t>
-      </w:r>
-      <w:r>
-        <w:t xml:space="preserve">el runner debe ejecutarse en la misma máquina donde corre Docker Desktop con Kubernetes habilitado, porque el job deploy llama directamente a docker y kubectl como si fueran comandos locales.</w:t>
-      </w:r>
-    </w:p>
-    <w:p>
-      <w:pPr>
-        <w:pStyle w:val="Heading2"/>
-      </w:pPr>
-      <w:r>
-        <w:t xml:space="preserve">5.4 Configurar protección de la rama main (paso 13 de la guía)</w:t>
+        <w:t xml:space="preserve">En GitHub: Settings → Actions → Runners → New self-hosted runner, eligiendo Linux. Seguir los comandos que GitHub muestra (descargar el paquete del runner, ./config.sh con la URL del repo, un token temporal, y un label adicional como aws-ec2).</w:t>
       </w:r>
     </w:p>
     <w:p>
@@ -2693,7 +2622,7 @@
         <w:spacing w:after="80"/>
       </w:pPr>
       <w:r>
-        <w:t xml:space="preserve">En GitHub: Settings → Branches → Add branch protection rule.</w:t>
+        <w:t xml:space="preserve">Instalar el runner como servicio con sudo ./svc.sh install &amp;&amp; sudo ./svc.sh start, para que siga corriendo aunque se cierre la sesión SSH.</w:t>
       </w:r>
     </w:p>
     <w:p>
@@ -2706,7 +2635,30 @@
         <w:spacing w:after="80"/>
       </w:pPr>
       <w:r>
-        <w:t xml:space="preserve">Branch name pattern: main.</w:t>
+        <w:t xml:space="preserve">Verificar en Settings → Actions → Runners que aparece como “Idle” (en línea, esperando trabajos).</w:t>
+      </w:r>
+    </w:p>
+    <w:p>
+      <w:pPr>
+        <w:spacing w:after="160"/>
+      </w:pPr>
+      <w:r>
+        <w:rPr>
+          <w:b/>
+          <w:bCs/>
+        </w:rPr>
+        <w:t xml:space="preserve">Importante: </w:t>
+      </w:r>
+      <w:r>
+        <w:t xml:space="preserve">el runner debe ejecutarse dentro de la instancia EC2 donde corre k3s, porque el job deploy llama directamente a kubectl como si fuera un comando local. Si queda otro runner self-hosted antiguo registrado (por ejemplo uno de pruebas en un computador local), conviene eliminarlo o detenerlo para que GitHub no intente asignarle el job por error.</w:t>
+      </w:r>
+    </w:p>
+    <w:p>
+      <w:pPr>
+        <w:pStyle w:val="Heading2"/>
+      </w:pPr>
+      <w:r>
+        <w:t xml:space="preserve">5.4 Configurar protección de la rama main (paso 13 de la guía)</w:t>
       </w:r>
     </w:p>
     <w:p>
@@ -2719,7 +2671,7 @@
         <w:spacing w:after="80"/>
       </w:pPr>
       <w:r>
-        <w:t xml:space="preserve">Activar “Require a pull request before merging” (con al menos 1 aprobación).</w:t>
+        <w:t xml:space="preserve">En GitHub: Settings → Branches → Add branch protection rule.</w:t>
       </w:r>
     </w:p>
     <w:p>
@@ -2732,7 +2684,7 @@
         <w:spacing w:after="80"/>
       </w:pPr>
       <w:r>
-        <w:t xml:space="preserve">Activar “Require status checks to pass before merging” y seleccionar el check build-test-sonar (aparecerá en la lista después de que el pipeline corra al menos una vez).</w:t>
+        <w:t xml:space="preserve">Branch name pattern: main.</w:t>
       </w:r>
     </w:p>
     <w:p>
@@ -2745,6 +2697,32 @@
         <w:spacing w:after="80"/>
       </w:pPr>
       <w:r>
+        <w:t xml:space="preserve">Activar “Require a pull request before merging” (con al menos 1 aprobación).</w:t>
+      </w:r>
+    </w:p>
+    <w:p>
+      <w:pPr>
+        <w:pStyle w:val="ListParagraph"/>
+        <w:numPr>
+          <w:ilvl w:val="0"/>
+          <w:numId w:val="3"/>
+        </w:numPr>
+        <w:spacing w:after="80"/>
+      </w:pPr>
+      <w:r>
+        <w:t xml:space="preserve">Activar “Require status checks to pass before merging” y seleccionar el check build-test-sonar (aparecerá en la lista después de que el pipeline corra al menos una vez).</w:t>
+      </w:r>
+    </w:p>
+    <w:p>
+      <w:pPr>
+        <w:pStyle w:val="ListParagraph"/>
+        <w:numPr>
+          <w:ilvl w:val="0"/>
+          <w:numId w:val="3"/>
+        </w:numPr>
+        <w:spacing w:after="80"/>
+      </w:pPr>
+      <w:r>
         <w:t xml:space="preserve">Guardar. Desde ese momento, nadie puede subir directo a main sin pasar por revisión y sin que el pipeline pase.</w:t>
       </w:r>
     </w:p>
@@ -2772,40 +2750,12 @@
           <w:szCs w:val="19"/>
         </w:rPr>
         <w:t xml:space="preserve">git push origin main</w:t>
-      </w:r>
-      <w:r>
-        <w:rPr>
-          <w:rFonts w:ascii="Consolas" w:cs="Consolas" w:eastAsia="Consolas" w:hAnsi="Consolas"/>
-          <w:sz w:val="19"/>
-          <w:szCs w:val="19"/>
-        </w:rPr>
         <w:br/>
         <w:t xml:space="preserve"/>
-      </w:r>
-      <w:r>
-        <w:rPr>
-          <w:rFonts w:ascii="Consolas" w:cs="Consolas" w:eastAsia="Consolas" w:hAnsi="Consolas"/>
-          <w:sz w:val="19"/>
-          <w:szCs w:val="19"/>
-        </w:rPr>
         <w:br/>
         <w:t xml:space="preserve"># en GitHub: pestaña "Actions" -&gt; ver el pipeline corriendo</w:t>
-      </w:r>
-      <w:r>
-        <w:rPr>
-          <w:rFonts w:ascii="Consolas" w:cs="Consolas" w:eastAsia="Consolas" w:hAnsi="Consolas"/>
-          <w:sz w:val="19"/>
-          <w:szCs w:val="19"/>
-        </w:rPr>
         <w:br/>
         <w:t xml:space="preserve"># cuando termine el job "deploy":</w:t>
-      </w:r>
-      <w:r>
-        <w:rPr>
-          <w:rFonts w:ascii="Consolas" w:cs="Consolas" w:eastAsia="Consolas" w:hAnsi="Consolas"/>
-          <w:sz w:val="19"/>
-          <w:szCs w:val="19"/>
-        </w:rPr>
         <w:br/>
         <w:t xml:space="preserve">kubectl get pods -n devops-usuarios -w</w:t>
       </w:r>
@@ -2949,7 +2899,7 @@
                 <w:sz w:val="21"/>
                 <w:szCs w:val="21"/>
               </w:rPr>
-              <w:t xml:space="preserve">http://localhost:30080/usuarios</w:t>
+              <w:t xml:space="preserve">http://&lt;IP_PUBLICA_EC2&gt;:30080/usuarios</w:t>
             </w:r>
           </w:p>
         </w:tc>
@@ -3007,7 +2957,7 @@
                 <w:sz w:val="21"/>
                 <w:szCs w:val="21"/>
               </w:rPr>
-              <w:t xml:space="preserve">http://localhost:30090</w:t>
+              <w:t xml:space="preserve">http://&lt;IP_PUBLICA_EC2&gt;:30090</w:t>
             </w:r>
           </w:p>
         </w:tc>
@@ -3065,7 +3015,7 @@
                 <w:sz w:val="21"/>
                 <w:szCs w:val="21"/>
               </w:rPr>
-              <w:t xml:space="preserve">http://localhost:30030 (admin / admin)</w:t>
+              <w:t xml:space="preserve">http://&lt;IP_PUBLICA_EC2&gt;:30030 (admin / admin)</w:t>
             </w:r>
           </w:p>
         </w:tc>
@@ -3123,7 +3073,7 @@
                 <w:sz w:val="21"/>
                 <w:szCs w:val="21"/>
               </w:rPr>
-              <w:t xml:space="preserve">http://localhost:30091</w:t>
+              <w:t xml:space="preserve">http://&lt;IP_PUBLICA_EC2&gt;:30091</w:t>
             </w:r>
           </w:p>
         </w:tc>
@@ -3514,7 +3464,7 @@
                 <w:sz w:val="21"/>
                 <w:szCs w:val="21"/>
               </w:rPr>
-              <w:t xml:space="preserve">Manifiestos listos; despliegue real al ejecutar (sección 5)</w:t>
+              <w:t xml:space="preserve">Listo, en k3s sobre una instancia EC2 de AWS Academy (sección 5)</w:t>
             </w:r>
           </w:p>
         </w:tc>
@@ -3828,7 +3778,7 @@
         <w:spacing w:after="80"/>
       </w:pPr>
       <w:r>
-        <w:t xml:space="preserve">Todo el código, manifiestos y pipeline se prepararon en un entorno sin Docker, kubectl ni un clúster de Kubernetes real, por lo que no pudieron ejecutarse ni probarse directamente ahí; el código Java se revisó manualmente (sin poder compilarlo) y los YAML se validaron sintácticamente con un parser, pero la validación funcional definitiva ocurre cuando el estudiante ejecuta los pasos de la sección 5.</w:t>
+        <w:t xml:space="preserve">Todo el código, manifiestos y pipeline se prepararon en un entorno sin Docker, kubectl, cuenta de AWS ni un clúster de Kubernetes real, por lo que no pudieron ejecutarse ni probarse directamente ahí; el código Java se revisó manualmente (sin poder compilarlo) y los YAML se validaron sintácticamente con un parser, pero la validación funcional definitiva ocurre cuando el estudiante ejecuta los pasos de la sección 5 sobre su propia instancia EC2.</w:t>
       </w:r>
     </w:p>
     <w:p>
@@ -3854,7 +3804,7 @@
         <w:spacing w:after="80"/>
       </w:pPr>
       <w:r>
-        <w:t xml:space="preserve">La protección de rama (paso 13) y el alta del runner self-hosted (paso 8) requieren acciones manuales únicas en la interfaz de GitHub, ya que no se pueden automatizar sin un token de administrador del repositorio.</w:t>
+        <w:t xml:space="preserve">La protección de rama (paso 13), el alta del runner self-hosted y el lanzamiento/configuración de la instancia EC2 requieren acciones manuales únicas en la interfaz de GitHub y de AWS Academy, ya que no se pueden automatizar sin credenciales de administrador.</w:t>
       </w:r>
     </w:p>
     <w:p>
@@ -3880,7 +3830,93 @@
         <w:spacing w:after="80"/>
       </w:pPr>
       <w:r>
-        <w:t xml:space="preserve">Las credenciales por defecto de Grafana y MySQL (admin/admin, root-2023) son válidas solo para este entorno académico local; no deben usarse así en producción.</w:t>
+        <w:t xml:space="preserve">Las credenciales por defecto de Grafana y MySQL (admin/admin, root-2023) son válidas solo para este entorno académico en la nube (instancia EC2 de uso exclusivo para la evaluación); no deben usarse así en un entorno productivo real.</w:t>
+      </w:r>
+    </w:p>
+    <w:p>
+      <w:pPr>
+        <w:pStyle w:val="ListParagraph"/>
+        <w:numPr>
+          <w:ilvl w:val="0"/>
+          <w:numId w:val="2"/>
+        </w:numPr>
+        <w:spacing w:after="80"/>
+      </w:pPr>
+      <w:r>
+        <w:t xml:space="preserve">La instancia EC2 usada es de tipo apto para capa gratuita (1 GiB de RAM), por lo que corre con un solo replica de la app y límites de memoria ajustados para toda la pila (app + MySQL + Prometheus + Grafana + Pushgateway + k3s); si se necesitara más margen, el siguiente paso sería subir a una instancia t3.small (2 GiB).</w:t>
+      </w:r>
+    </w:p>
+    <w:p>
+      <w:pPr>
+        <w:pStyle w:val="Heading1"/>
+      </w:pPr>
+      <w:r>
+        <w:t xml:space="preserve">9. Declaración de uso de Inteligencia Artificial</w:t>
+      </w:r>
+    </w:p>
+    <w:p>
+      <w:pPr>
+        <w:spacing w:after="160"/>
+      </w:pPr>
+      <w:r>
+        <w:rPr>
+          <w:b/>
+          <w:bCs/>
+        </w:rPr>
+        <w:t xml:space="preserve">Herramienta utilizada: </w:t>
+      </w:r>
+      <w:r>
+        <w:t xml:space="preserve">Claude (Anthropic), a través de Cowork/Claude Code, en modalidad agente con acceso a archivos y a una terminal sandbox.</w:t>
+      </w:r>
+    </w:p>
+    <w:p>
+      <w:pPr>
+        <w:spacing w:after="160"/>
+      </w:pPr>
+      <w:r>
+        <w:rPr>
+          <w:b/>
+          <w:bCs/>
+        </w:rPr>
+        <w:t xml:space="preserve">Cómo se usó: </w:t>
+      </w:r>
+      <w:r>
+        <w:t xml:space="preserve">se usó para generar y editar código (controller, DTO, pruebas unitarias, manifiestos de Kubernetes, pipeline de GitHub Actions), para depurar errores concretos del pipeline (autenticación de SonarCloud, Quality Gate, vulnerabilidad de mass assignment, problemas de red de Docker Desktop, sintaxis PowerShell vs. bash) y para redactar este documento y el README. Todo el código generado fue revisado y ejecutado por el estudiante siguiendo los pasos de la sección 5; las decisiones de arquitectura (por ejemplo, migrar de un despliegue local a AWS Academy Learner Lab) fueron tomadas por el estudiante, quien las planteó y aprobó explícitamente en cada punto de decisión.</w:t>
+      </w:r>
+    </w:p>
+    <w:p>
+      <w:pPr>
+        <w:spacing w:after="160"/>
+      </w:pPr>
+      <w:r>
+        <w:rPr>
+          <w:b/>
+          <w:bCs/>
+        </w:rPr>
+        <w:t xml:space="preserve">Cita: </w:t>
+      </w:r>
+      <w:r>
+        <w:t xml:space="preserve">uso de IA citado conforme a la guía de la biblioteca Duoc UC (https://bibliotecas.duoc.cl/ia).</w:t>
+      </w:r>
+    </w:p>
+    <w:p>
+      <w:pPr>
+        <w:spacing w:after="160"/>
+      </w:pPr>
+      <w:r>
+        <w:rPr>
+          <w:b/>
+          <w:bCs/>
+        </w:rPr>
+        <w:t xml:space="preserve">Reflexión individual (Diego Roble) — NO generada por IA: </w:t>
+      </w:r>
+      <w:r>
+        <w:rPr>
+          <w:i/>
+          <w:iCs/>
+          <w:color w:val="A6A6A6"/>
+        </w:rPr>
+        <w:t xml:space="preserve">[Espacio reservado: escribe aquí, con tus propias palabras, qué aprendiste, qué decisiones tomaste tú y por qué, y qué harías distinto. Esta sección la debe redactar el estudiante; no puede ser generada por una IA, según la regla explícita de la rúbrica EP3.]</w:t>
       </w:r>
     </w:p>
     <w:sectPr>

</xml_diff>

<commit_message>
docs: actualizar documentacion con evidencia de fallas controladas (6.1 y 6.2)
</commit_message>
<xml_diff>
--- a/docs/Documentacion_Solucion_DevOps.docx
+++ b/docs/Documentacion_Solucion_DevOps.docx
@@ -55,7 +55,7 @@
           <w:sz w:val="24"/>
           <w:szCs w:val="24"/>
         </w:rPr>
-        <w:t xml:space="preserve">Autor: Diego Roble</w:t>
+        <w:t xml:space="preserve">Autores: Diego Roble, Vicente Pérez</w:t>
       </w:r>
     </w:p>
     <w:p>
@@ -172,7 +172,7 @@
         <w:t xml:space="preserve">Alcance de este documento: </w:t>
       </w:r>
       <w:r>
-        <w:t xml:space="preserve">se preparó todo el código, configuración e infraestructura como código (manifiestos, pipeline, dashboards). La ejecución real (build de Docker, despliegue en Kubernetes, push a GitHub) se realiza en una instancia EC2 (Ubuntu 22.04) de AWS Academy Learner Lab con k3s instalado, siguiendo la sección 5 “Puesta en marcha”, porque requiere una cuenta de AWS, kubectl y credenciales de GitHub que no existen en el entorno donde se preparó esta solución.</w:t>
+        <w:t xml:space="preserve">se preparó todo el código, configuración e infraestructura como código (manifiestos, pipeline, dashboards). La ejecución real (build de Docker, despliegue en Kubernetes, push a GitHub) se realiza en una instancia EC2 t3.small (Ubuntu 24.04 LTS, 2 GiB de RAM) de AWS Academy Learner Lab con k3s instalado, siguiendo la sección 5 “Puesta en marcha”, porque requiere una cuenta de AWS, kubectl y credenciales de GitHub que no existen en el entorno donde se preparó esta solución.</w:t>
       </w:r>
     </w:p>
     <w:p>
@@ -2447,7 +2447,7 @@
         <w:spacing w:after="80"/>
       </w:pPr>
       <w:r>
-        <w:t xml:space="preserve">Cuenta de AWS Academy Learner Lab activa, con una instancia EC2 (Ubuntu 22.04, tipo apto para capa gratuita como t3.micro/t2.micro) y k3s instalado (ver sección 5.3).</w:t>
+        <w:t xml:space="preserve">Cuenta de AWS Academy Learner Lab activa, con una instancia EC2 t3.small (Ubuntu 24.04 LTS, 2 GiB de RAM) y k3s instalado (ver sección 5.3).</w:t>
       </w:r>
     </w:p>
     <w:p>
@@ -2570,7 +2570,7 @@
         <w:spacing w:after="80"/>
       </w:pPr>
       <w:r>
-        <w:t xml:space="preserve">En la consola de AWS Academy Learner Lab: Start Lab → EC2 → Launch Instance. AMI Ubuntu 22.04, tipo de instancia apto para capa gratuita (t3.micro o t2.micro), crear/descargar key pair, y un Security Group con el puerto 22 (SSH) y el rango 30000-32767 (NodePorts de Kubernetes) abiertos.</w:t>
+        <w:t xml:space="preserve">En la consola de AWS Academy Learner Lab: Start Lab → EC2 → Launch Instance. AMI Ubuntu 24.04 LTS, tipo de instancia t3.small (2 GiB de RAM; los tipos de capa gratuita t3.micro/t2.micro, con solo 1 GiB, resultaron insuficientes para correr la app + MySQL + Prometheus + Grafana + Pushgateway + k3s a la vez, ver sección de Limitaciones conocidas), crear/descargar key pair, y un Security Group con el puerto 22 (SSH) y el rango 30000-32767 (NodePorts de Kubernetes) abiertos.</w:t>
       </w:r>
     </w:p>
     <w:p>
@@ -2596,7 +2596,7 @@
         <w:spacing w:after="80"/>
       </w:pPr>
       <w:r>
-        <w:t xml:space="preserve">Por SSH, crear un archivo de swap (la instancia de capa gratuita tiene solo 1 GiB de RAM, justo para la app + MySQL + Prometheus + Grafana + Pushgateway + k3s) e instalar k3s con curl -sfL https://get.k3s.io | sh -.</w:t>
+        <w:t xml:space="preserve">Por SSH, crear un archivo de swap (margen de seguridad adicional sobre los 2 GiB de RAM de la instancia t3.small, repartidos entre la app + MySQL + Prometheus + Grafana + Pushgateway + k3s) e instalar k3s con curl -sfL https://get.k3s.io | sh -.</w:t>
       </w:r>
     </w:p>
     <w:p>
@@ -3175,22 +3175,6 @@
     </w:p>
     <w:p>
       <w:pPr>
-        <w:pStyle w:val="Heading2"/>
-      </w:pPr>
-      <w:r>
-        <w:t xml:space="preserve">6.2 Provocar un fallo de Quality Gate</w:t>
-      </w:r>
-    </w:p>
-    <w:p>
-      <w:pPr>
-        <w:spacing w:after="160"/>
-      </w:pPr>
-      <w:r>
-        <w:t xml:space="preserve">Es más lento de preparar (SonarCloud necesita reglas que se puedan violar fácilmente), por lo que normalmente basta con documentar el mecanismo: el flag -Dsonar.qualitygate.wait=true hace que el comando Maven termine con error si SonarCloud marca el análisis como “Failed” (por ejemplo, por bugs críticos nuevos o cobertura por debajo del umbral configurado). El efecto sobre el pipeline es idéntico al caso anterior: el job falla y los siguientes no corren.</w:t>
-      </w:r>
-    </w:p>
-    <w:p>
-      <w:pPr>
         <w:spacing w:after="160"/>
       </w:pPr>
       <w:r>
@@ -3198,10 +3182,285 @@
           <w:b/>
           <w:bCs/>
         </w:rPr>
-        <w:t xml:space="preserve">Evidencia a capturar: </w:t>
-      </w:r>
-      <w:r>
-        <w:t xml:space="preserve">captura de pantalla de la pestaña Actions mostrando el job build-test-sonar en rojo y los jobs docker-build-push/deploy sin ejecutar, más el log de la consola mostrando el motivo exacto del fallo (test fallido o Quality Gate “Failed”).</w:t>
+        <w:t xml:space="preserve">Evidencia capturada: </w:t>
+      </w:r>
+      <w:r>
+        <w:t xml:space="preserve">se abrió el pull request “demo-falla-tests”, que contiene la aserción incorrecta de la prueba unitaria descrita arriba. El job “build-test-sonar” del pipeline falló como se esperaba, y los jobs “docker-build-push” y “deploy” se omitieron automáticamente por la dependencia “needs” del workflow.</w:t>
+      </w:r>
+    </w:p>
+    <w:p>
+      <w:pPr>
+        <w:spacing w:after="40" w:before="120"/>
+        <w:jc w:val="center"/>
+      </w:pPr>
+      <w:r>
+        <w:drawing>
+          <wp:inline distT="0" distB="0" distL="0" distR="0">
+            <wp:extent cx="5943600" cy="1624948"/>
+            <wp:effectExtent t="0" r="0" b="0" l="0"/>
+            <wp:docPr id="100" name="evidencia_61_overview" descr="Resumen del pull request demo-falla-tests con el job build-test-sonar en rojo y los jobs docker-build-push y deploy omitidos" title="Evidencia 6.1 - resumen del pipeline"/>
+            <wp:cNvGraphicFramePr>
+              <a:graphicFrameLocks xmlns:a="http://schemas.openxmlformats.org/drawingml/2006/main" noChangeAspect="1"/>
+            </wp:cNvGraphicFramePr>
+            <a:graphic xmlns:a="http://schemas.openxmlformats.org/drawingml/2006/main">
+              <a:graphicData uri="http://schemas.openxmlformats.org/drawingml/2006/picture">
+                <pic:pic xmlns:pic="http://schemas.openxmlformats.org/drawingml/2006/picture">
+                  <pic:nvPicPr>
+                    <pic:cNvPr id="0" name="" descr=""/>
+                    <pic:cNvPicPr>
+                      <a:picLocks noChangeAspect="1" noChangeArrowheads="1"/>
+                    </pic:cNvPicPr>
+                  </pic:nvPicPr>
+                  <pic:blipFill>
+                    <a:blip r:embed="rId9" cstate="none"/>
+                    <a:srcRect/>
+                    <a:stretch>
+                      <a:fillRect/>
+                    </a:stretch>
+                  </pic:blipFill>
+                  <pic:spPr bwMode="auto">
+                    <a:xfrm>
+                      <a:off x="0" y="0"/>
+                      <a:ext cx="5943600" cy="1624948"/>
+                    </a:xfrm>
+                    <a:prstGeom prst="rect">
+                      <a:avLst/>
+                    </a:prstGeom>
+                  </pic:spPr>
+                </pic:pic>
+              </a:graphicData>
+            </a:graphic>
+          </wp:inline>
+        </w:drawing>
+      </w:r>
+    </w:p>
+    <w:p>
+      <w:pPr>
+        <w:spacing w:after="160"/>
+        <w:jc w:val="center"/>
+      </w:pPr>
+      <w:r>
+        <w:rPr>
+          <w:i/>
+          <w:iCs/>
+          <w:sz w:val="20"/>
+          <w:szCs w:val="20"/>
+        </w:rPr>
+        <w:t xml:space="preserve">Resumen del pull request “demo-falla-tests”: build-test-sonar en rojo (59s); docker-build-push y deploy omitidos.</w:t>
+      </w:r>
+    </w:p>
+    <w:p>
+      <w:pPr>
+        <w:spacing w:after="40" w:before="120"/>
+        <w:jc w:val="center"/>
+      </w:pPr>
+      <w:r>
+        <w:drawing>
+          <wp:inline distT="0" distB="0" distL="0" distR="0">
+            <wp:extent cx="5943600" cy="3454048"/>
+            <wp:effectExtent t="0" r="0" b="0" l="0"/>
+            <wp:docPr id="101" name="evidencia_61_log" descr="Log expandido del job build-test-sonar mostrando la falla JUnit esperado valor incorrecto pero fue Diego" title="Evidencia 6.1 - log de la falla"/>
+            <wp:cNvGraphicFramePr>
+              <a:graphicFrameLocks xmlns:a="http://schemas.openxmlformats.org/drawingml/2006/main" noChangeAspect="1"/>
+            </wp:cNvGraphicFramePr>
+            <a:graphic xmlns:a="http://schemas.openxmlformats.org/drawingml/2006/main">
+              <a:graphicData uri="http://schemas.openxmlformats.org/drawingml/2006/picture">
+                <pic:pic xmlns:pic="http://schemas.openxmlformats.org/drawingml/2006/picture">
+                  <pic:nvPicPr>
+                    <pic:cNvPr id="0" name="" descr=""/>
+                    <pic:cNvPicPr>
+                      <a:picLocks noChangeAspect="1" noChangeArrowheads="1"/>
+                    </pic:cNvPicPr>
+                  </pic:nvPicPr>
+                  <pic:blipFill>
+                    <a:blip r:embed="rId10" cstate="none"/>
+                    <a:srcRect/>
+                    <a:stretch>
+                      <a:fillRect/>
+                    </a:stretch>
+                  </pic:blipFill>
+                  <pic:spPr bwMode="auto">
+                    <a:xfrm>
+                      <a:off x="0" y="0"/>
+                      <a:ext cx="5943600" cy="3454048"/>
+                    </a:xfrm>
+                    <a:prstGeom prst="rect">
+                      <a:avLst/>
+                    </a:prstGeom>
+                  </pic:spPr>
+                </pic:pic>
+              </a:graphicData>
+            </a:graphic>
+          </wp:inline>
+        </w:drawing>
+      </w:r>
+    </w:p>
+    <w:p>
+      <w:pPr>
+        <w:spacing w:after="160"/>
+        <w:jc w:val="center"/>
+      </w:pPr>
+      <w:r>
+        <w:rPr>
+          <w:i/>
+          <w:iCs/>
+          <w:sz w:val="20"/>
+          <w:szCs w:val="20"/>
+        </w:rPr>
+        <w:t xml:space="preserve">Log expandido del job build-test-sonar: “expected: valor incorrecto but was: Diego”, Tests run: 15, Failures: 1, BUILD FAILURE.</w:t>
+      </w:r>
+    </w:p>
+    <w:p>
+      <w:pPr>
+        <w:pStyle w:val="Heading2"/>
+      </w:pPr>
+      <w:r>
+        <w:t xml:space="preserve">6.2 Provocar un fallo de Quality Gate</w:t>
+      </w:r>
+    </w:p>
+    <w:p>
+      <w:pPr>
+        <w:spacing w:after="160"/>
+      </w:pPr>
+      <w:r>
+        <w:t xml:space="preserve">Es más lento de preparar (SonarCloud necesita reglas que se puedan violar fácilmente), por lo que normalmente basta con documentar el mecanismo: el flag -Dsonar.qualitygate.wait=true hace que el comando Maven termine con error si SonarCloud marca el análisis como “Failed” (por ejemplo, por bugs críticos nuevos o cobertura por debajo del umbral configurado). El efecto sobre el pipeline es idéntico al caso anterior: el job falla y los siguientes no corren.</w:t>
+      </w:r>
+    </w:p>
+    <w:p>
+      <w:pPr>
+        <w:spacing w:after="160"/>
+      </w:pPr>
+      <w:r>
+        <w:rPr>
+          <w:b/>
+          <w:bCs/>
+        </w:rPr>
+        <w:t xml:space="preserve">Evidencia capturada: </w:t>
+      </w:r>
+      <w:r>
+        <w:t xml:space="preserve">se agregó un segundo método sin pruebas para superar el umbral de 20 líneas nuevas que SonarCloud usa para no penalizar cambios chicos. Con eso, el Quality Gate evaluó la cobertura del código nuevo (0%), marcó el análisis como “Failed” y el job “build-test-sonar” falló con QUALITY GATE STATUS: FAILED; los jobs “docker-build-push” y “deploy” se omitieron automáticamente.</w:t>
+      </w:r>
+    </w:p>
+    <w:p>
+      <w:pPr>
+        <w:spacing w:after="40" w:before="120"/>
+        <w:jc w:val="center"/>
+      </w:pPr>
+      <w:r>
+        <w:drawing>
+          <wp:inline distT="0" distB="0" distL="0" distR="0">
+            <wp:extent cx="5943600" cy="1862328"/>
+            <wp:effectExtent t="0" r="0" b="0" l="0"/>
+            <wp:docPr id="102" name="evidencia_62_overview" descr="Resumen del run fallido del pipeline con build-test-sonar en rojo y docker-build-push y deploy omitidos" title="Evidencia 6.2 - resumen del pipeline"/>
+            <wp:cNvGraphicFramePr>
+              <a:graphicFrameLocks xmlns:a="http://schemas.openxmlformats.org/drawingml/2006/main" noChangeAspect="1"/>
+            </wp:cNvGraphicFramePr>
+            <a:graphic xmlns:a="http://schemas.openxmlformats.org/drawingml/2006/main">
+              <a:graphicData uri="http://schemas.openxmlformats.org/drawingml/2006/picture">
+                <pic:pic xmlns:pic="http://schemas.openxmlformats.org/drawingml/2006/picture">
+                  <pic:nvPicPr>
+                    <pic:cNvPr id="0" name="" descr=""/>
+                    <pic:cNvPicPr>
+                      <a:picLocks noChangeAspect="1" noChangeArrowheads="1"/>
+                    </pic:cNvPicPr>
+                  </pic:nvPicPr>
+                  <pic:blipFill>
+                    <a:blip r:embed="rId11" cstate="none"/>
+                    <a:srcRect/>
+                    <a:stretch>
+                      <a:fillRect/>
+                    </a:stretch>
+                  </pic:blipFill>
+                  <pic:spPr bwMode="auto">
+                    <a:xfrm>
+                      <a:off x="0" y="0"/>
+                      <a:ext cx="5943600" cy="1862328"/>
+                    </a:xfrm>
+                    <a:prstGeom prst="rect">
+                      <a:avLst/>
+                    </a:prstGeom>
+                  </pic:spPr>
+                </pic:pic>
+              </a:graphicData>
+            </a:graphic>
+          </wp:inline>
+        </w:drawing>
+      </w:r>
+    </w:p>
+    <w:p>
+      <w:pPr>
+        <w:spacing w:after="160"/>
+        <w:jc w:val="center"/>
+      </w:pPr>
+      <w:r>
+        <w:rPr>
+          <w:i/>
+          <w:iCs/>
+          <w:sz w:val="20"/>
+          <w:szCs w:val="20"/>
+        </w:rPr>
+        <w:t xml:space="preserve">Run #19 del PR “demo-falla-quality-gate”: build-test-sonar en rojo (1m 26s); docker-build-push y deploy omitidos.</w:t>
+      </w:r>
+    </w:p>
+    <w:p>
+      <w:pPr>
+        <w:spacing w:after="40" w:before="120"/>
+        <w:jc w:val="center"/>
+      </w:pPr>
+      <w:r>
+        <w:drawing>
+          <wp:inline distT="0" distB="0" distL="0" distR="0">
+            <wp:extent cx="5943600" cy="2399619"/>
+            <wp:effectExtent t="0" r="0" b="0" l="0"/>
+            <wp:docPr id="103" name="evidencia_62_log" descr="Log expandido del job build-test-sonar mostrando QUALITY GATE STATUS FAILED" title="Evidencia 6.2 - log de la falla"/>
+            <wp:cNvGraphicFramePr>
+              <a:graphicFrameLocks xmlns:a="http://schemas.openxmlformats.org/drawingml/2006/main" noChangeAspect="1"/>
+            </wp:cNvGraphicFramePr>
+            <a:graphic xmlns:a="http://schemas.openxmlformats.org/drawingml/2006/main">
+              <a:graphicData uri="http://schemas.openxmlformats.org/drawingml/2006/picture">
+                <pic:pic xmlns:pic="http://schemas.openxmlformats.org/drawingml/2006/picture">
+                  <pic:nvPicPr>
+                    <pic:cNvPr id="0" name="" descr=""/>
+                    <pic:cNvPicPr>
+                      <a:picLocks noChangeAspect="1" noChangeArrowheads="1"/>
+                    </pic:cNvPicPr>
+                  </pic:nvPicPr>
+                  <pic:blipFill>
+                    <a:blip r:embed="rId12" cstate="none"/>
+                    <a:srcRect/>
+                    <a:stretch>
+                      <a:fillRect/>
+                    </a:stretch>
+                  </pic:blipFill>
+                  <pic:spPr bwMode="auto">
+                    <a:xfrm>
+                      <a:off x="0" y="0"/>
+                      <a:ext cx="5943600" cy="2399619"/>
+                    </a:xfrm>
+                    <a:prstGeom prst="rect">
+                      <a:avLst/>
+                    </a:prstGeom>
+                  </pic:spPr>
+                </pic:pic>
+              </a:graphicData>
+            </a:graphic>
+          </wp:inline>
+        </w:drawing>
+      </w:r>
+    </w:p>
+    <w:p>
+      <w:pPr>
+        <w:spacing w:after="160"/>
+        <w:jc w:val="center"/>
+      </w:pPr>
+      <w:r>
+        <w:rPr>
+          <w:i/>
+          <w:iCs/>
+          <w:sz w:val="20"/>
+          <w:szCs w:val="20"/>
+        </w:rPr>
+        <w:t xml:space="preserve">Log expandido: “QUALITY GATE STATUS: FAILED”, con el link al dashboard de SonarCloud para el detalle de la condición incumplida (cobertura en código nuevo).</w:t>
       </w:r>
     </w:p>
     <w:p>
@@ -3696,7 +3955,7 @@
                 <w:sz w:val="21"/>
                 <w:szCs w:val="21"/>
               </w:rPr>
-              <w:t xml:space="preserve">Procedimiento listo (sección 6); capturarla al ejecutar</w:t>
+              <w:t xml:space="preserve">Listo</w:t>
             </w:r>
           </w:p>
         </w:tc>
@@ -3843,7 +4102,7 @@
         <w:spacing w:after="80"/>
       </w:pPr>
       <w:r>
-        <w:t xml:space="preserve">La instancia EC2 usada es de tipo apto para capa gratuita (1 GiB de RAM), por lo que corre con un solo replica de la app y límites de memoria ajustados para toda la pila (app + MySQL + Prometheus + Grafana + Pushgateway + k3s); si se necesitara más margen, el siguiente paso sería subir a una instancia t3.small (2 GiB).</w:t>
+        <w:t xml:space="preserve">La instancia EC2 usada es t3.small (2 GiB de RAM), por lo que corre con un solo replica de la app y límites de memoria ajustados para toda la pila (app + MySQL + Prometheus + Grafana + Pushgateway + k3s). Durante las pruebas se intentó primero con una instancia de capa gratuita (t3.micro/t2.micro, 1 GiB de RAM); con esa RAM el plano de control de k3s entraba en falta de memoria al nivel del nodo completo (no de un contenedor individual) apenas se sumaban todos los componentes, provocando reinicios en cadena. Subir a t3.small (2 GiB) resolvió la causa raíz; si se necesitara aún más margen, el siguiente paso sería t3.medium (4 GiB).</w:t>
       </w:r>
     </w:p>
     <w:p>
@@ -3908,15 +4167,39 @@
           <w:b/>
           <w:bCs/>
         </w:rPr>
-        <w:t xml:space="preserve">Reflexión individual (Diego Roble) — NO generada por IA: </w:t>
-      </w:r>
-      <w:r>
-        <w:rPr>
-          <w:i/>
-          <w:iCs/>
-          <w:color w:val="A6A6A6"/>
-        </w:rPr>
-        <w:t xml:space="preserve">[Espacio reservado: escribe aquí, con tus propias palabras, qué aprendiste, qué decisiones tomaste tú y por qué, y qué harías distinto. Esta sección la debe redactar el estudiante; no puede ser generada por una IA, según la regla explícita de la rúbrica EP3.]</w:t>
+        <w:t xml:space="preserve">Reflexión conjunta (Diego Roble y Vicente Pérez) — NO generada por IA: </w:t>
+      </w:r>
+    </w:p>
+    <w:p>
+      <w:pPr>
+        <w:spacing w:after="160"/>
+      </w:pPr>
+      <w:r>
+        <w:t xml:space="preserve">Esta evaluación nos hizo entender algo que no esperábamos: que tener el pipeline en verde no significa nada si el servidor de abajo no da abasto. Fuimos resolviendo los problemas de a uno, y cada uno llevaba a otro. Primero un taint de disk-pressure que tenía todos los pods bloqueados, después un ReplicaSet viejo que seguía corriendo y le comía la memoria al pod nuevo (eso nos pasó dos veces), luego MySQL cayendo por OOM porque la imagen mysql:8 había cambiado de versión sin que nos diéramos cuenta, y al final el nodo entero quedándose sin RAM con todo el stack de monitoreo encima de una instancia de 1 GiB.</w:t>
+      </w:r>
+    </w:p>
+    <w:p>
+      <w:pPr>
+        <w:spacing w:after="160"/>
+      </w:pPr>
+      <w:r>
+        <w:t xml:space="preserve">Lo que más discutimos fue qué hacer con la memoria. Podríamos haber seguido recortando límites o sacando componentes, pero decidimos subir la instancia a t3.small (2 GiB). Revisamos primero que el costo en AWS Academy fuera mínimo para el tiempo que la íbamos a usar, y sí lo era, así que no había razón para seguir peleando con algo tan limitado.</w:t>
+      </w:r>
+    </w:p>
+    <w:p>
+      <w:pPr>
+        <w:spacing w:after="160"/>
+      </w:pPr>
+      <w:r>
+        <w:t xml:space="preserve">Otra cosa que aprendimos es a no confiar en el primer error que aparece. Varias veces el log mostraba una excepción, como el NullPointerException de Hibernate, que en realidad estaba tapando el problema real. Tuvimos que leer los logs completos y probar las credenciales a mano para encontrar la causa de fondo.</w:t>
+      </w:r>
+    </w:p>
+    <w:p>
+      <w:pPr>
+        <w:spacing w:after="160"/>
+      </w:pPr>
+      <w:r>
+        <w:t xml:space="preserve">Si lo hiciéramos de nuevo, dimensionaríamos la instancia pensando en el peor caso desde el principio, no al límite justo. Nos queda claro que en DevOps la mayoría de los problemas no son de código, sino de recursos, de configuración, y de tener paciencia para leer bien antes de asumir.</w:t>
       </w:r>
     </w:p>
     <w:sectPr>

</xml_diff>

<commit_message>
docs: actualizar documentacion con evidencia (6.1/6.2) e IP publica real
</commit_message>
<xml_diff>
--- a/docs/Documentacion_Solucion_DevOps.docx
+++ b/docs/Documentacion_Solucion_DevOps.docx
@@ -2899,7 +2899,7 @@
                 <w:sz w:val="21"/>
                 <w:szCs w:val="21"/>
               </w:rPr>
-              <w:t xml:space="preserve">http://&lt;IP_PUBLICA_EC2&gt;:30080/usuarios</w:t>
+              <w:t xml:space="preserve">http://52.54.36.238:30080/usuarios</w:t>
             </w:r>
           </w:p>
         </w:tc>
@@ -2957,7 +2957,7 @@
                 <w:sz w:val="21"/>
                 <w:szCs w:val="21"/>
               </w:rPr>
-              <w:t xml:space="preserve">http://&lt;IP_PUBLICA_EC2&gt;:30090</w:t>
+              <w:t xml:space="preserve">http://52.54.36.238:30090</w:t>
             </w:r>
           </w:p>
         </w:tc>
@@ -3015,7 +3015,7 @@
                 <w:sz w:val="21"/>
                 <w:szCs w:val="21"/>
               </w:rPr>
-              <w:t xml:space="preserve">http://&lt;IP_PUBLICA_EC2&gt;:30030 (admin / admin)</w:t>
+              <w:t xml:space="preserve">http://52.54.36.238:30030 (admin / admin)</w:t>
             </w:r>
           </w:p>
         </w:tc>
@@ -3073,7 +3073,7 @@
                 <w:sz w:val="21"/>
                 <w:szCs w:val="21"/>
               </w:rPr>
-              <w:t xml:space="preserve">http://&lt;IP_PUBLICA_EC2&gt;:30091</w:t>
+              <w:t xml:space="preserve">http://52.54.36.238:30091</w:t>
             </w:r>
           </w:p>
         </w:tc>

</xml_diff>

<commit_message>
docs: actualizar documentacion con evidencia (6.1/6.2), IP publica real y capturas de servicios funcionando
</commit_message>
<xml_diff>
--- a/docs/Documentacion_Solucion_DevOps.docx
+++ b/docs/Documentacion_Solucion_DevOps.docx
@@ -3079,6 +3079,265 @@
         </w:tc>
       </w:tr>
     </w:tbl>
+    <w:p>
+      <w:pPr>
+        <w:spacing w:after="160" w:before="120"/>
+      </w:pPr>
+      <w:r>
+        <w:rPr>
+          <w:b/>
+          <w:bCs/>
+        </w:rPr>
+        <w:t xml:space="preserve">Evidencia capturada: </w:t>
+      </w:r>
+      <w:r>
+        <w:t xml:space="preserve">se accedió desde el navegador a las cuatro URLs públicas de la tabla anterior (Elastic IP 52.54.36.238), confirmando que la app, Prometheus, Grafana y Pushgateway están desplegados y respondiendo correctamente en la instancia EC2.</w:t>
+      </w:r>
+    </w:p>
+    <w:p>
+      <w:pPr>
+        <w:spacing w:after="40" w:before="120"/>
+        <w:jc w:val="center"/>
+      </w:pPr>
+      <w:r>
+        <w:drawing>
+          <wp:inline distT="0" distB="0" distL="0" distR="0">
+            <wp:extent cx="5943600" cy="2259550"/>
+            <wp:effectExtent t="0" r="0" b="0" l="0"/>
+            <wp:docPr id="104" name="evidencia_ip_app" descr="Respuesta JSON vacia del endpoint de usuarios accedido desde el navegador, confirmando que la API esta arriba" title="Evidencia - App accesible"/>
+            <wp:cNvGraphicFramePr>
+              <a:graphicFrameLocks xmlns:a="http://schemas.openxmlformats.org/drawingml/2006/main" noChangeAspect="1"/>
+            </wp:cNvGraphicFramePr>
+            <a:graphic xmlns:a="http://schemas.openxmlformats.org/drawingml/2006/main">
+              <a:graphicData uri="http://schemas.openxmlformats.org/drawingml/2006/picture">
+                <pic:pic xmlns:pic="http://schemas.openxmlformats.org/drawingml/2006/picture">
+                  <pic:nvPicPr>
+                    <pic:cNvPr id="0" name="" descr=""/>
+                    <pic:cNvPicPr>
+                      <a:picLocks noChangeAspect="1" noChangeArrowheads="1"/>
+                    </pic:cNvPicPr>
+                  </pic:nvPicPr>
+                  <pic:blipFill>
+                    <a:blip r:embed="rId13" cstate="none"/>
+                    <a:srcRect/>
+                    <a:stretch>
+                      <a:fillRect/>
+                    </a:stretch>
+                  </pic:blipFill>
+                  <pic:spPr bwMode="auto">
+                    <a:xfrm>
+                      <a:off x="0" y="0"/>
+                      <a:ext cx="5943600" cy="2259550"/>
+                    </a:xfrm>
+                    <a:prstGeom prst="rect">
+                      <a:avLst/>
+                    </a:prstGeom>
+                  </pic:spPr>
+                </pic:pic>
+              </a:graphicData>
+            </a:graphic>
+          </wp:inline>
+        </w:drawing>
+      </w:r>
+    </w:p>
+    <w:p>
+      <w:pPr>
+        <w:spacing w:after="160"/>
+        <w:jc w:val="center"/>
+      </w:pPr>
+      <w:r>
+        <w:rPr>
+          <w:i/>
+          <w:iCs/>
+          <w:sz w:val="20"/>
+          <w:szCs w:val="20"/>
+        </w:rPr>
+        <w:t xml:space="preserve">App (API de usuarios): respuesta JSON vacía ([]) en http://52.54.36.238:30080/usuarios.</w:t>
+      </w:r>
+    </w:p>
+    <w:p>
+      <w:pPr>
+        <w:spacing w:after="40" w:before="120"/>
+        <w:jc w:val="center"/>
+      </w:pPr>
+      <w:r>
+        <w:drawing>
+          <wp:inline distT="0" distB="0" distL="0" distR="0">
+            <wp:extent cx="5943600" cy="2964829"/>
+            <wp:effectExtent t="0" r="0" b="0" l="0"/>
+            <wp:docPr id="105" name="evidencia_ip_prometheus" descr="Pestaña Status Targets de Prometheus mostrando los jobs pushgateway y springboot-app en estado UP" title="Evidencia - Prometheus Targets"/>
+            <wp:cNvGraphicFramePr>
+              <a:graphicFrameLocks xmlns:a="http://schemas.openxmlformats.org/drawingml/2006/main" noChangeAspect="1"/>
+            </wp:cNvGraphicFramePr>
+            <a:graphic xmlns:a="http://schemas.openxmlformats.org/drawingml/2006/main">
+              <a:graphicData uri="http://schemas.openxmlformats.org/drawingml/2006/picture">
+                <pic:pic xmlns:pic="http://schemas.openxmlformats.org/drawingml/2006/picture">
+                  <pic:nvPicPr>
+                    <pic:cNvPr id="0" name="" descr=""/>
+                    <pic:cNvPicPr>
+                      <a:picLocks noChangeAspect="1" noChangeArrowheads="1"/>
+                    </pic:cNvPicPr>
+                  </pic:nvPicPr>
+                  <pic:blipFill>
+                    <a:blip r:embed="rId14" cstate="none"/>
+                    <a:srcRect/>
+                    <a:stretch>
+                      <a:fillRect/>
+                    </a:stretch>
+                  </pic:blipFill>
+                  <pic:spPr bwMode="auto">
+                    <a:xfrm>
+                      <a:off x="0" y="0"/>
+                      <a:ext cx="5943600" cy="2964829"/>
+                    </a:xfrm>
+                    <a:prstGeom prst="rect">
+                      <a:avLst/>
+                    </a:prstGeom>
+                  </pic:spPr>
+                </pic:pic>
+              </a:graphicData>
+            </a:graphic>
+          </wp:inline>
+        </w:drawing>
+      </w:r>
+    </w:p>
+    <w:p>
+      <w:pPr>
+        <w:spacing w:after="160"/>
+        <w:jc w:val="center"/>
+      </w:pPr>
+      <w:r>
+        <w:rPr>
+          <w:i/>
+          <w:iCs/>
+          <w:sz w:val="20"/>
+          <w:szCs w:val="20"/>
+        </w:rPr>
+        <w:t xml:space="preserve">Prometheus – Status &gt; Targets: los jobs “pushgateway” y “springboot-app” en estado UP.</w:t>
+      </w:r>
+    </w:p>
+    <w:p>
+      <w:pPr>
+        <w:spacing w:after="40" w:before="120"/>
+        <w:jc w:val="center"/>
+      </w:pPr>
+      <w:r>
+        <w:drawing>
+          <wp:inline distT="0" distB="0" distL="0" distR="0">
+            <wp:extent cx="5943600" cy="2971800"/>
+            <wp:effectExtent t="0" r="0" b="0" l="0"/>
+            <wp:docPr id="106" name="evidencia_ip_grafana" descr="Dashboard de Grafana DevOps proyecto springboot usuarios con metricas reales de CPU memoria disponibilidad y cobertura" title="Evidencia - Dashboard Grafana"/>
+            <wp:cNvGraphicFramePr>
+              <a:graphicFrameLocks xmlns:a="http://schemas.openxmlformats.org/drawingml/2006/main" noChangeAspect="1"/>
+            </wp:cNvGraphicFramePr>
+            <a:graphic xmlns:a="http://schemas.openxmlformats.org/drawingml/2006/main">
+              <a:graphicData uri="http://schemas.openxmlformats.org/drawingml/2006/picture">
+                <pic:pic xmlns:pic="http://schemas.openxmlformats.org/drawingml/2006/picture">
+                  <pic:nvPicPr>
+                    <pic:cNvPr id="0" name="" descr=""/>
+                    <pic:cNvPicPr>
+                      <a:picLocks noChangeAspect="1" noChangeArrowheads="1"/>
+                    </pic:cNvPicPr>
+                  </pic:nvPicPr>
+                  <pic:blipFill>
+                    <a:blip r:embed="rId15" cstate="none"/>
+                    <a:srcRect/>
+                    <a:stretch>
+                      <a:fillRect/>
+                    </a:stretch>
+                  </pic:blipFill>
+                  <pic:spPr bwMode="auto">
+                    <a:xfrm>
+                      <a:off x="0" y="0"/>
+                      <a:ext cx="5943600" cy="2971800"/>
+                    </a:xfrm>
+                    <a:prstGeom prst="rect">
+                      <a:avLst/>
+                    </a:prstGeom>
+                  </pic:spPr>
+                </pic:pic>
+              </a:graphicData>
+            </a:graphic>
+          </wp:inline>
+        </w:drawing>
+      </w:r>
+    </w:p>
+    <w:p>
+      <w:pPr>
+        <w:spacing w:after="160"/>
+        <w:jc w:val="center"/>
+      </w:pPr>
+      <w:r>
+        <w:rPr>
+          <w:i/>
+          <w:iCs/>
+          <w:sz w:val="20"/>
+          <w:szCs w:val="20"/>
+        </w:rPr>
+        <w:t xml:space="preserve">Grafana – dashboard “DevOps - proyecto_springboot_usuarios” con datos reales: CPU, memoria JVM, disponibilidad y cobertura de pruebas.</w:t>
+      </w:r>
+    </w:p>
+    <w:p>
+      <w:pPr>
+        <w:spacing w:after="40" w:before="120"/>
+        <w:jc w:val="center"/>
+      </w:pPr>
+      <w:r>
+        <w:drawing>
+          <wp:inline distT="0" distB="0" distL="0" distR="0">
+            <wp:extent cx="5943600" cy="2985774"/>
+            <wp:effectExtent t="0" r="0" b="0" l="0"/>
+            <wp:docPr id="107" name="evidencia_ip_pushgateway" descr="Metricas publicadas en Pushgateway por el job deploy del pipeline duracion cobertura y timestamps" title="Evidencia - Pushgateway"/>
+            <wp:cNvGraphicFramePr>
+              <a:graphicFrameLocks xmlns:a="http://schemas.openxmlformats.org/drawingml/2006/main" noChangeAspect="1"/>
+            </wp:cNvGraphicFramePr>
+            <a:graphic xmlns:a="http://schemas.openxmlformats.org/drawingml/2006/main">
+              <a:graphicData uri="http://schemas.openxmlformats.org/drawingml/2006/picture">
+                <pic:pic xmlns:pic="http://schemas.openxmlformats.org/drawingml/2006/picture">
+                  <pic:nvPicPr>
+                    <pic:cNvPr id="0" name="" descr=""/>
+                    <pic:cNvPicPr>
+                      <a:picLocks noChangeAspect="1" noChangeArrowheads="1"/>
+                    </pic:cNvPicPr>
+                  </pic:nvPicPr>
+                  <pic:blipFill>
+                    <a:blip r:embed="rId16" cstate="none"/>
+                    <a:srcRect/>
+                    <a:stretch>
+                      <a:fillRect/>
+                    </a:stretch>
+                  </pic:blipFill>
+                  <pic:spPr bwMode="auto">
+                    <a:xfrm>
+                      <a:off x="0" y="0"/>
+                      <a:ext cx="5943600" cy="2985774"/>
+                    </a:xfrm>
+                    <a:prstGeom prst="rect">
+                      <a:avLst/>
+                    </a:prstGeom>
+                  </pic:spPr>
+                </pic:pic>
+              </a:graphicData>
+            </a:graphic>
+          </wp:inline>
+        </w:drawing>
+      </w:r>
+    </w:p>
+    <w:p>
+      <w:pPr>
+        <w:spacing w:after="160"/>
+        <w:jc w:val="center"/>
+      </w:pPr>
+      <w:r>
+        <w:rPr>
+          <w:i/>
+          <w:iCs/>
+          <w:sz w:val="20"/>
+          <w:szCs w:val="20"/>
+        </w:rPr>
+        <w:t xml:space="preserve">Pushgateway: métricas publicadas por el job “deploy” del pipeline (duración, cobertura, timestamps de push).</w:t>
+      </w:r>
+    </w:p>
     <w:p>
       <w:r>
         <w:br w:type="page"/>

</xml_diff>

<commit_message>
docs: corregir numeracion de listas e indice vacio en el Word
</commit_message>
<xml_diff>
--- a/docs/Documentacion_Solucion_DevOps.docx
+++ b/docs/Documentacion_Solucion_DevOps.docx
@@ -1749,7 +1749,7 @@
         <w:pStyle w:val="ListParagraph"/>
         <w:numPr>
           <w:ilvl w:val="0"/>
-          <w:numId w:val="3"/>
+          <w:numId w:val="10"/>
         </w:numPr>
         <w:spacing w:after="80"/>
       </w:pPr>
@@ -1762,7 +1762,7 @@
         <w:pStyle w:val="ListParagraph"/>
         <w:numPr>
           <w:ilvl w:val="0"/>
-          <w:numId w:val="3"/>
+          <w:numId w:val="10"/>
         </w:numPr>
         <w:spacing w:after="80"/>
       </w:pPr>
@@ -1775,7 +1775,7 @@
         <w:pStyle w:val="ListParagraph"/>
         <w:numPr>
           <w:ilvl w:val="0"/>
-          <w:numId w:val="3"/>
+          <w:numId w:val="10"/>
         </w:numPr>
         <w:spacing w:after="80"/>
       </w:pPr>
@@ -2515,7 +2515,7 @@
         <w:pStyle w:val="ListParagraph"/>
         <w:numPr>
           <w:ilvl w:val="0"/>
-          <w:numId w:val="3"/>
+          <w:numId w:val="11"/>
         </w:numPr>
         <w:spacing w:after="80"/>
       </w:pPr>
@@ -2528,7 +2528,7 @@
         <w:pStyle w:val="ListParagraph"/>
         <w:numPr>
           <w:ilvl w:val="0"/>
-          <w:numId w:val="3"/>
+          <w:numId w:val="11"/>
         </w:numPr>
         <w:spacing w:after="80"/>
       </w:pPr>
@@ -2565,7 +2565,7 @@
         <w:pStyle w:val="ListParagraph"/>
         <w:numPr>
           <w:ilvl w:val="0"/>
-          <w:numId w:val="3"/>
+          <w:numId w:val="12"/>
         </w:numPr>
         <w:spacing w:after="80"/>
       </w:pPr>
@@ -2578,7 +2578,7 @@
         <w:pStyle w:val="ListParagraph"/>
         <w:numPr>
           <w:ilvl w:val="0"/>
-          <w:numId w:val="3"/>
+          <w:numId w:val="12"/>
         </w:numPr>
         <w:spacing w:after="80"/>
       </w:pPr>
@@ -2591,7 +2591,7 @@
         <w:pStyle w:val="ListParagraph"/>
         <w:numPr>
           <w:ilvl w:val="0"/>
-          <w:numId w:val="3"/>
+          <w:numId w:val="12"/>
         </w:numPr>
         <w:spacing w:after="80"/>
       </w:pPr>
@@ -2604,7 +2604,7 @@
         <w:pStyle w:val="ListParagraph"/>
         <w:numPr>
           <w:ilvl w:val="0"/>
-          <w:numId w:val="3"/>
+          <w:numId w:val="12"/>
         </w:numPr>
         <w:spacing w:after="80"/>
       </w:pPr>
@@ -2617,7 +2617,7 @@
         <w:pStyle w:val="ListParagraph"/>
         <w:numPr>
           <w:ilvl w:val="0"/>
-          <w:numId w:val="3"/>
+          <w:numId w:val="12"/>
         </w:numPr>
         <w:spacing w:after="80"/>
       </w:pPr>
@@ -2630,7 +2630,7 @@
         <w:pStyle w:val="ListParagraph"/>
         <w:numPr>
           <w:ilvl w:val="0"/>
-          <w:numId w:val="3"/>
+          <w:numId w:val="12"/>
         </w:numPr>
         <w:spacing w:after="80"/>
       </w:pPr>
@@ -2666,7 +2666,7 @@
         <w:pStyle w:val="ListParagraph"/>
         <w:numPr>
           <w:ilvl w:val="0"/>
-          <w:numId w:val="3"/>
+          <w:numId w:val="13"/>
         </w:numPr>
         <w:spacing w:after="80"/>
       </w:pPr>
@@ -2679,7 +2679,7 @@
         <w:pStyle w:val="ListParagraph"/>
         <w:numPr>
           <w:ilvl w:val="0"/>
-          <w:numId w:val="3"/>
+          <w:numId w:val="13"/>
         </w:numPr>
         <w:spacing w:after="80"/>
       </w:pPr>
@@ -2692,7 +2692,7 @@
         <w:pStyle w:val="ListParagraph"/>
         <w:numPr>
           <w:ilvl w:val="0"/>
-          <w:numId w:val="3"/>
+          <w:numId w:val="13"/>
         </w:numPr>
         <w:spacing w:after="80"/>
       </w:pPr>
@@ -2705,7 +2705,7 @@
         <w:pStyle w:val="ListParagraph"/>
         <w:numPr>
           <w:ilvl w:val="0"/>
-          <w:numId w:val="3"/>
+          <w:numId w:val="13"/>
         </w:numPr>
         <w:spacing w:after="80"/>
       </w:pPr>
@@ -2718,7 +2718,7 @@
         <w:pStyle w:val="ListParagraph"/>
         <w:numPr>
           <w:ilvl w:val="0"/>
-          <w:numId w:val="3"/>
+          <w:numId w:val="13"/>
         </w:numPr>
         <w:spacing w:after="80"/>
       </w:pPr>
@@ -3372,7 +3372,7 @@
         <w:pStyle w:val="ListParagraph"/>
         <w:numPr>
           <w:ilvl w:val="0"/>
-          <w:numId w:val="3"/>
+          <w:numId w:val="14"/>
         </w:numPr>
         <w:spacing w:after="80"/>
       </w:pPr>
@@ -3385,7 +3385,7 @@
         <w:pStyle w:val="ListParagraph"/>
         <w:numPr>
           <w:ilvl w:val="0"/>
-          <w:numId w:val="3"/>
+          <w:numId w:val="14"/>
         </w:numPr>
         <w:spacing w:after="80"/>
       </w:pPr>
@@ -3398,7 +3398,7 @@
         <w:pStyle w:val="ListParagraph"/>
         <w:numPr>
           <w:ilvl w:val="0"/>
-          <w:numId w:val="3"/>
+          <w:numId w:val="14"/>
         </w:numPr>
         <w:spacing w:after="80"/>
       </w:pPr>
@@ -3411,7 +3411,7 @@
         <w:pStyle w:val="ListParagraph"/>
         <w:numPr>
           <w:ilvl w:val="0"/>
-          <w:numId w:val="3"/>
+          <w:numId w:val="14"/>
         </w:numPr>
         <w:spacing w:after="80"/>
       </w:pPr>
@@ -3424,7 +3424,7 @@
         <w:pStyle w:val="ListParagraph"/>
         <w:numPr>
           <w:ilvl w:val="0"/>
-          <w:numId w:val="3"/>
+          <w:numId w:val="14"/>
         </w:numPr>
         <w:spacing w:after="80"/>
       </w:pPr>
@@ -4672,6 +4672,36 @@
     </w:lvlOverride>
   </w:num>
   <w:num w:numId="3">
+    <w:abstractNumId w:val="3"/>
+    <w:lvlOverride w:ilvl="0">
+      <w:startOverride w:val="1"/>
+    </w:lvlOverride>
+  </w:num>
+  <w:num w:numId="10">
+    <w:abstractNumId w:val="3"/>
+    <w:lvlOverride w:ilvl="0">
+      <w:startOverride w:val="1"/>
+    </w:lvlOverride>
+  </w:num>
+  <w:num w:numId="11">
+    <w:abstractNumId w:val="3"/>
+    <w:lvlOverride w:ilvl="0">
+      <w:startOverride w:val="1"/>
+    </w:lvlOverride>
+  </w:num>
+  <w:num w:numId="12">
+    <w:abstractNumId w:val="3"/>
+    <w:lvlOverride w:ilvl="0">
+      <w:startOverride w:val="1"/>
+    </w:lvlOverride>
+  </w:num>
+  <w:num w:numId="13">
+    <w:abstractNumId w:val="3"/>
+    <w:lvlOverride w:ilvl="0">
+      <w:startOverride w:val="1"/>
+    </w:lvlOverride>
+  </w:num>
+  <w:num w:numId="14">
     <w:abstractNumId w:val="3"/>
     <w:lvlOverride w:ilvl="0">
       <w:startOverride w:val="1"/>

</xml_diff>